<commit_message>
Enforce 'The Once Rule': de-dupe Pauly's; codify editorial standards
Fix: Pauly's/Zarzour's appeared in both Week 1 and Week 2 (and twice
within Week 2) - reads forced/AI-slop. Now it appears once, only in
Week 2's Building's Biography; Week 1 and Week 2 What's New get distinct
verified items (Stone Age Korean BBQ; Pedestrian Wine & Cheese). Codify
in Content Architecture: The Once Rule (once/issue, max twice/month and
rare), cross-issue freshness, and the Nerd's veto on forced/lazy/
paid-looking/AI-slop copy to protect brand integrity.

https://claude.ai/code/session_01MZCcvfRxTVSc6PAak7p1Nw
</commit_message>
<xml_diff>
--- a/Content_Architecture.docx
+++ b/Content_Architecture.docx
@@ -186,6 +186,149 @@
           <w:sz w:val="17"/>
         </w:rPr>
         <w:t>Figure 1. The content portfolio in three layers, every one feeding the ad-free model.</w:t>
+      </w:r>
+    </w:p>
+    <w:p>
+      <w:pPr>
+        <w:spacing w:before="240" w:after="80"/>
+        <w:pBdr>
+          <w:bottom w:val="single" w:sz="6" w:space="2" w:color="2A9D8F"/>
+        </w:pBdr>
+      </w:pPr>
+      <w:r>
+        <w:rPr>
+          <w:b/>
+          <w:color w:val="1B3A4B"/>
+          <w:sz w:val="32"/>
+        </w:rPr>
+        <w:t>Editorial standards — The Once Rule &amp; the Nerd's veto</w:t>
+      </w:r>
+    </w:p>
+    <w:p>
+      <w:pPr>
+        <w:spacing w:after="100"/>
+      </w:pPr>
+      <w:r>
+        <w:rPr>
+          <w:i w:val="0"/>
+          <w:sz w:val="21"/>
+        </w:rPr>
+        <w:t>These are non-negotiable, because repetition and filler make independent editorial look like advertising or automation — the two things that would destroy the brand's whole premise and the founder's personal credibility.</w:t>
+      </w:r>
+    </w:p>
+    <w:p>
+      <w:pPr>
+        <w:pStyle w:val="ListBullet"/>
+        <w:spacing w:after="60"/>
+      </w:pPr>
+      <w:r>
+        <w:rPr>
+          <w:b/>
+          <w:sz w:val="20"/>
+        </w:rPr>
+        <w:t>The Once Rule.</w:t>
+      </w:r>
+      <w:r>
+        <w:rPr>
+          <w:sz w:val="20"/>
+        </w:rPr>
+        <w:t xml:space="preserve"> A business or location appears </w:t>
+      </w:r>
+      <w:r>
+        <w:rPr>
+          <w:b/>
+          <w:sz w:val="20"/>
+        </w:rPr>
+        <w:t>once per issue — never twice.</w:t>
+      </w:r>
+      <w:r>
+        <w:rPr>
+          <w:sz w:val="20"/>
+        </w:rPr>
+        <w:t xml:space="preserve"> Across a month, </w:t>
+      </w:r>
+      <w:r>
+        <w:rPr>
+          <w:b/>
+          <w:sz w:val="20"/>
+        </w:rPr>
+        <w:t>no more than twice, and twice is rare</w:t>
+      </w:r>
+      <w:r>
+        <w:rPr>
+          <w:sz w:val="20"/>
+        </w:rPr>
+        <w:t xml:space="preserve"> — reserved for genuine news (a closing, then later a reopening) and always from a *fresh* angle, never a repeat. Recurring *threads* are welcome; recurring *mentions of the same name* are not.</w:t>
+      </w:r>
+    </w:p>
+    <w:p>
+      <w:pPr>
+        <w:pStyle w:val="ListBullet"/>
+        <w:spacing w:after="60"/>
+      </w:pPr>
+      <w:r>
+        <w:rPr>
+          <w:b/>
+          <w:sz w:val="20"/>
+        </w:rPr>
+        <w:t>Freshness across issues.</w:t>
+      </w:r>
+      <w:r>
+        <w:rPr>
+          <w:sz w:val="20"/>
+        </w:rPr>
+        <w:t xml:space="preserve"> Each issue's cast of businesses should be distinct from the last issue's. If a place was the Hidden Gem last week, it is not the 'now open' note this week.</w:t>
+      </w:r>
+    </w:p>
+    <w:p>
+      <w:pPr>
+        <w:pStyle w:val="ListBullet"/>
+        <w:spacing w:after="60"/>
+      </w:pPr>
+      <w:r>
+        <w:rPr>
+          <w:b/>
+          <w:sz w:val="20"/>
+        </w:rPr>
+        <w:t>The Nerd's veto.</w:t>
+      </w:r>
+      <w:r>
+        <w:rPr>
+          <w:sz w:val="20"/>
+        </w:rPr>
+        <w:t xml:space="preserve"> The research layer does more than check facts — it </w:t>
+      </w:r>
+      <w:r>
+        <w:rPr>
+          <w:b/>
+          <w:sz w:val="20"/>
+        </w:rPr>
+        <w:t>kills copy that reads forced, lazy, padded, or 'paid-for,' and anything that smells like AI slop</w:t>
+      </w:r>
+      <w:r>
+        <w:rPr>
+          <w:sz w:val="20"/>
+        </w:rPr>
+        <w:t xml:space="preserve"> (recycled names, generic filler, the same story told twice). If it wouldn't survive a sharp local reader's eye, it doesn't run.</w:t>
+      </w:r>
+    </w:p>
+    <w:p>
+      <w:pPr>
+        <w:pStyle w:val="ListBullet"/>
+        <w:spacing w:after="60"/>
+      </w:pPr>
+      <w:r>
+        <w:rPr>
+          <w:b/>
+          <w:sz w:val="20"/>
+        </w:rPr>
+        <w:t>The test before publish:</w:t>
+      </w:r>
+      <w:r>
+        <w:rPr>
+          <w:sz w:val="20"/>
+        </w:rPr>
+        <w:t xml:space="preserve"> would a skeptical Chattanoogan think this was written by a person who actually went there — or by a machine padding a template? Only the first ships.</w:t>
       </w:r>
     </w:p>
     <w:p>

</xml_diff>